<commit_message>
Modified reports on data analysis
</commit_message>
<xml_diff>
--- a/Assembler/Guide.docx
+++ b/Assembler/Guide.docx
@@ -1,6 +1,6 @@
 
 <file path=word/document.xml><?xml version="1.0" encoding="utf-8"?>
-<w:document xmlns:wpc="http://schemas.microsoft.com/office/word/2010/wordprocessingCanvas" xmlns:cx="http://schemas.microsoft.com/office/drawing/2014/chartex" xmlns:cx1="http://schemas.microsoft.com/office/drawing/2015/9/8/chartex" xmlns:cx2="http://schemas.microsoft.com/office/drawing/2015/10/21/chartex" xmlns:cx3="http://schemas.microsoft.com/office/drawing/2016/5/9/chartex" xmlns:cx4="http://schemas.microsoft.com/office/drawing/2016/5/10/chartex" xmlns:cx5="http://schemas.microsoft.com/office/drawing/2016/5/11/chartex" xmlns:cx6="http://schemas.microsoft.com/office/drawing/2016/5/12/chartex" xmlns:cx7="http://schemas.microsoft.com/office/drawing/2016/5/13/chartex" xmlns:cx8="http://schemas.microsoft.com/office/drawing/2016/5/14/chartex" xmlns:mc="http://schemas.openxmlformats.org/markup-compatibility/2006" xmlns:aink="http://schemas.microsoft.com/office/drawing/2016/ink" xmlns:am3d="http://schemas.microsoft.com/office/drawing/2017/model3d" xmlns:o="urn:schemas-microsoft-com:office:office" xmlns:r="http://schemas.openxmlformats.org/officeDocument/2006/relationships" xmlns:m="http://schemas.openxmlformats.org/officeDocument/2006/math" xmlns:v="urn:schemas-microsoft-com:vml" xmlns:wp14="http://schemas.microsoft.com/office/word/2010/wordprocessingDrawing" xmlns:wp="http://schemas.openxmlformats.org/drawingml/2006/wordprocessingDrawing" xmlns:w10="urn:schemas-microsoft-com:office:word" xmlns:w="http://schemas.openxmlformats.org/wordprocessingml/2006/main" xmlns:w14="http://schemas.microsoft.com/office/word/2010/wordml" xmlns:w15="http://schemas.microsoft.com/office/word/2012/wordml" xmlns:w16cex="http://schemas.microsoft.com/office/word/2018/wordml/cex" xmlns:w16cid="http://schemas.microsoft.com/office/word/2016/wordml/cid" xmlns:w16="http://schemas.microsoft.com/office/word/2018/wordml" xmlns:w16sdtdh="http://schemas.microsoft.com/office/word/2020/wordml/sdtdatahash" xmlns:w16se="http://schemas.microsoft.com/office/word/2015/wordml/symex" xmlns:wpg="http://schemas.microsoft.com/office/word/2010/wordprocessingGroup" xmlns:wpi="http://schemas.microsoft.com/office/word/2010/wordprocessingInk" xmlns:wne="http://schemas.microsoft.com/office/word/2006/wordml" xmlns:wps="http://schemas.microsoft.com/office/word/2010/wordprocessingShape" mc:Ignorable="w14 w15 w16se w16cid w16 w16cex w16sdtdh wp14">
+<w:document xmlns:wpc="http://schemas.microsoft.com/office/word/2010/wordprocessingCanvas" xmlns:cx="http://schemas.microsoft.com/office/drawing/2014/chartex" xmlns:cx1="http://schemas.microsoft.com/office/drawing/2015/9/8/chartex" xmlns:cx2="http://schemas.microsoft.com/office/drawing/2015/10/21/chartex" xmlns:cx3="http://schemas.microsoft.com/office/drawing/2016/5/9/chartex" xmlns:cx4="http://schemas.microsoft.com/office/drawing/2016/5/10/chartex" xmlns:cx5="http://schemas.microsoft.com/office/drawing/2016/5/11/chartex" xmlns:cx6="http://schemas.microsoft.com/office/drawing/2016/5/12/chartex" xmlns:cx7="http://schemas.microsoft.com/office/drawing/2016/5/13/chartex" xmlns:cx8="http://schemas.microsoft.com/office/drawing/2016/5/14/chartex" xmlns:mc="http://schemas.openxmlformats.org/markup-compatibility/2006" xmlns:aink="http://schemas.microsoft.com/office/drawing/2016/ink" xmlns:am3d="http://schemas.microsoft.com/office/drawing/2017/model3d" xmlns:o="urn:schemas-microsoft-com:office:office" xmlns:oel="http://schemas.microsoft.com/office/2019/extlst" xmlns:r="http://schemas.openxmlformats.org/officeDocument/2006/relationships" xmlns:m="http://schemas.openxmlformats.org/officeDocument/2006/math" xmlns:v="urn:schemas-microsoft-com:vml" xmlns:wp14="http://schemas.microsoft.com/office/word/2010/wordprocessingDrawing" xmlns:wp="http://schemas.openxmlformats.org/drawingml/2006/wordprocessingDrawing" xmlns:w10="urn:schemas-microsoft-com:office:word" xmlns:w="http://schemas.openxmlformats.org/wordprocessingml/2006/main" xmlns:w14="http://schemas.microsoft.com/office/word/2010/wordml" xmlns:w15="http://schemas.microsoft.com/office/word/2012/wordml" xmlns:w16cex="http://schemas.microsoft.com/office/word/2018/wordml/cex" xmlns:w16cid="http://schemas.microsoft.com/office/word/2016/wordml/cid" xmlns:w16="http://schemas.microsoft.com/office/word/2018/wordml" xmlns:w16du="http://schemas.microsoft.com/office/word/2023/wordml/word16du" xmlns:w16sdtdh="http://schemas.microsoft.com/office/word/2020/wordml/sdtdatahash" xmlns:w16sdtfl="http://schemas.microsoft.com/office/word/2024/wordml/sdtformatlock" xmlns:w16se="http://schemas.microsoft.com/office/word/2015/wordml/symex" xmlns:wpg="http://schemas.microsoft.com/office/word/2010/wordprocessingGroup" xmlns:wpi="http://schemas.microsoft.com/office/word/2010/wordprocessingInk" xmlns:wne="http://schemas.microsoft.com/office/word/2006/wordml" xmlns:wps="http://schemas.microsoft.com/office/word/2010/wordprocessingShape" mc:Ignorable="w14 w15 w16se w16cid w16 w16cex w16sdtdh w16sdtfl w16du wp14">
   <w:body>
     <w:p>
       <w:pPr>
@@ -2040,17 +2040,39 @@
           <w:sz w:val="24"/>
           <w:szCs w:val="24"/>
         </w:rPr>
-        <w:t xml:space="preserve">    </w:t>
-      </w:r>
-      <w:r>
-        <w:rPr>
-          <w:rFonts w:ascii="Times New Roman" w:hAnsi="Times New Roman" w:cs="Times New Roman"/>
-          <w:i/>
-          <w:iCs/>
-          <w:sz w:val="24"/>
-          <w:szCs w:val="24"/>
-        </w:rPr>
-        <w:t>; метка _</w:t>
+        <w:t xml:space="preserve">  </w:t>
+      </w:r>
+      <w:proofErr w:type="gramStart"/>
+      <w:r>
+        <w:rPr>
+          <w:rFonts w:ascii="Times New Roman" w:hAnsi="Times New Roman" w:cs="Times New Roman"/>
+          <w:i/>
+          <w:iCs/>
+          <w:sz w:val="24"/>
+          <w:szCs w:val="24"/>
+        </w:rPr>
+        <w:t xml:space="preserve">  </w:t>
+      </w:r>
+      <w:r>
+        <w:rPr>
+          <w:rFonts w:ascii="Times New Roman" w:hAnsi="Times New Roman" w:cs="Times New Roman"/>
+          <w:i/>
+          <w:iCs/>
+          <w:sz w:val="24"/>
+          <w:szCs w:val="24"/>
+        </w:rPr>
+        <w:t>;</w:t>
+      </w:r>
+      <w:proofErr w:type="gramEnd"/>
+      <w:r>
+        <w:rPr>
+          <w:rFonts w:ascii="Times New Roman" w:hAnsi="Times New Roman" w:cs="Times New Roman"/>
+          <w:i/>
+          <w:iCs/>
+          <w:sz w:val="24"/>
+          <w:szCs w:val="24"/>
+        </w:rPr>
+        <w:t xml:space="preserve"> метка _</w:t>
       </w:r>
       <w:proofErr w:type="spellStart"/>
       <w:r>
@@ -2685,16 +2707,29 @@
         <w:t xml:space="preserve"> /</w:t>
       </w:r>
       <w:proofErr w:type="spellStart"/>
-      <w:r>
-        <w:rPr>
-          <w:rFonts w:ascii="Times New Roman" w:hAnsi="Times New Roman" w:cs="Times New Roman"/>
-          <w:i/>
-          <w:iCs/>
-          <w:sz w:val="24"/>
-          <w:szCs w:val="24"/>
-          <w:lang w:val="en-US"/>
-        </w:rPr>
-        <w:t>entry:_start</w:t>
+      <w:proofErr w:type="gramStart"/>
+      <w:r>
+        <w:rPr>
+          <w:rFonts w:ascii="Times New Roman" w:hAnsi="Times New Roman" w:cs="Times New Roman"/>
+          <w:i/>
+          <w:iCs/>
+          <w:sz w:val="24"/>
+          <w:szCs w:val="24"/>
+          <w:lang w:val="en-US"/>
+        </w:rPr>
+        <w:t>entry:_</w:t>
+      </w:r>
+      <w:proofErr w:type="gramEnd"/>
+      <w:r>
+        <w:rPr>
+          <w:rFonts w:ascii="Times New Roman" w:hAnsi="Times New Roman" w:cs="Times New Roman"/>
+          <w:i/>
+          <w:iCs/>
+          <w:sz w:val="24"/>
+          <w:szCs w:val="24"/>
+          <w:lang w:val="en-US"/>
+        </w:rPr>
+        <w:t>start</w:t>
       </w:r>
       <w:proofErr w:type="spellEnd"/>
       <w:r>
@@ -2709,6 +2744,7 @@
         <w:t xml:space="preserve"> /</w:t>
       </w:r>
       <w:proofErr w:type="spellStart"/>
+      <w:proofErr w:type="gramStart"/>
       <w:r>
         <w:rPr>
           <w:rFonts w:ascii="Times New Roman" w:hAnsi="Times New Roman" w:cs="Times New Roman"/>
@@ -2721,17 +2757,31 @@
         <w:t>subsystem:console</w:t>
       </w:r>
       <w:proofErr w:type="spellEnd"/>
-      <w:r>
-        <w:rPr>
-          <w:rFonts w:ascii="Times New Roman" w:hAnsi="Times New Roman" w:cs="Times New Roman"/>
-          <w:i/>
-          <w:iCs/>
-          <w:sz w:val="24"/>
-          <w:szCs w:val="24"/>
-          <w:lang w:val="en-US"/>
-        </w:rPr>
-        <w:t xml:space="preserve"> /out:hello.exe</w:t>
-      </w:r>
+      <w:proofErr w:type="gramEnd"/>
+      <w:r>
+        <w:rPr>
+          <w:rFonts w:ascii="Times New Roman" w:hAnsi="Times New Roman" w:cs="Times New Roman"/>
+          <w:i/>
+          <w:iCs/>
+          <w:sz w:val="24"/>
+          <w:szCs w:val="24"/>
+          <w:lang w:val="en-US"/>
+        </w:rPr>
+        <w:t xml:space="preserve"> /</w:t>
+      </w:r>
+      <w:proofErr w:type="gramStart"/>
+      <w:r>
+        <w:rPr>
+          <w:rFonts w:ascii="Times New Roman" w:hAnsi="Times New Roman" w:cs="Times New Roman"/>
+          <w:i/>
+          <w:iCs/>
+          <w:sz w:val="24"/>
+          <w:szCs w:val="24"/>
+          <w:lang w:val="en-US"/>
+        </w:rPr>
+        <w:t>out:hello.exe</w:t>
+      </w:r>
+      <w:proofErr w:type="gramEnd"/>
     </w:p>
     <w:p>
       <w:pPr>
@@ -2872,17 +2922,7 @@
           <w:sz w:val="24"/>
           <w:szCs w:val="24"/>
         </w:rPr>
-        <w:t>:</w:t>
-      </w:r>
-      <w:r>
-        <w:rPr>
-          <w:rFonts w:ascii="Times New Roman" w:hAnsi="Times New Roman" w:cs="Times New Roman"/>
-          <w:b/>
-          <w:bCs/>
-          <w:sz w:val="24"/>
-          <w:szCs w:val="24"/>
-        </w:rPr>
-        <w:t>_</w:t>
+        <w:t>:_</w:t>
       </w:r>
       <w:proofErr w:type="gramEnd"/>
       <w:r>
@@ -2902,7 +2942,25 @@
           <w:sz w:val="24"/>
           <w:szCs w:val="24"/>
         </w:rPr>
-        <w:t xml:space="preserve"> указывает компоновщику на точку входа в программу - это наша метка </w:t>
+        <w:t xml:space="preserve"> указывает компоновщику на точку входа в программу </w:t>
+      </w:r>
+      <w:proofErr w:type="gramStart"/>
+      <w:r>
+        <w:rPr>
+          <w:rFonts w:ascii="Times New Roman" w:hAnsi="Times New Roman" w:cs="Times New Roman"/>
+          <w:sz w:val="24"/>
+          <w:szCs w:val="24"/>
+        </w:rPr>
+        <w:t>- это</w:t>
+      </w:r>
+      <w:proofErr w:type="gramEnd"/>
+      <w:r>
+        <w:rPr>
+          <w:rFonts w:ascii="Times New Roman" w:hAnsi="Times New Roman" w:cs="Times New Roman"/>
+          <w:sz w:val="24"/>
+          <w:szCs w:val="24"/>
+        </w:rPr>
+        <w:t xml:space="preserve"> наша метка </w:t>
       </w:r>
       <w:r>
         <w:rPr>
@@ -3519,16 +3577,29 @@
         <w:t xml:space="preserve"> /</w:t>
       </w:r>
       <w:proofErr w:type="spellStart"/>
-      <w:r>
-        <w:rPr>
-          <w:rFonts w:ascii="Times New Roman" w:hAnsi="Times New Roman" w:cs="Times New Roman"/>
-          <w:i/>
-          <w:iCs/>
-          <w:sz w:val="24"/>
-          <w:szCs w:val="24"/>
-          <w:lang w:val="en-US"/>
-        </w:rPr>
-        <w:t>entry:_start</w:t>
+      <w:proofErr w:type="gramStart"/>
+      <w:r>
+        <w:rPr>
+          <w:rFonts w:ascii="Times New Roman" w:hAnsi="Times New Roman" w:cs="Times New Roman"/>
+          <w:i/>
+          <w:iCs/>
+          <w:sz w:val="24"/>
+          <w:szCs w:val="24"/>
+          <w:lang w:val="en-US"/>
+        </w:rPr>
+        <w:t>entry:_</w:t>
+      </w:r>
+      <w:proofErr w:type="gramEnd"/>
+      <w:r>
+        <w:rPr>
+          <w:rFonts w:ascii="Times New Roman" w:hAnsi="Times New Roman" w:cs="Times New Roman"/>
+          <w:i/>
+          <w:iCs/>
+          <w:sz w:val="24"/>
+          <w:szCs w:val="24"/>
+          <w:lang w:val="en-US"/>
+        </w:rPr>
+        <w:t>start</w:t>
       </w:r>
       <w:proofErr w:type="spellEnd"/>
       <w:r>
@@ -3543,6 +3614,7 @@
         <w:t xml:space="preserve"> /</w:t>
       </w:r>
       <w:proofErr w:type="spellStart"/>
+      <w:proofErr w:type="gramStart"/>
       <w:r>
         <w:rPr>
           <w:rFonts w:ascii="Times New Roman" w:hAnsi="Times New Roman" w:cs="Times New Roman"/>
@@ -3555,17 +3627,31 @@
         <w:t>subsystem:console</w:t>
       </w:r>
       <w:proofErr w:type="spellEnd"/>
-      <w:r>
-        <w:rPr>
-          <w:rFonts w:ascii="Times New Roman" w:hAnsi="Times New Roman" w:cs="Times New Roman"/>
-          <w:i/>
-          <w:iCs/>
-          <w:sz w:val="24"/>
-          <w:szCs w:val="24"/>
-          <w:lang w:val="en-US"/>
-        </w:rPr>
-        <w:t xml:space="preserve"> /out:hello.exe</w:t>
-      </w:r>
+      <w:proofErr w:type="gramEnd"/>
+      <w:r>
+        <w:rPr>
+          <w:rFonts w:ascii="Times New Roman" w:hAnsi="Times New Roman" w:cs="Times New Roman"/>
+          <w:i/>
+          <w:iCs/>
+          <w:sz w:val="24"/>
+          <w:szCs w:val="24"/>
+          <w:lang w:val="en-US"/>
+        </w:rPr>
+        <w:t xml:space="preserve"> /</w:t>
+      </w:r>
+      <w:proofErr w:type="gramStart"/>
+      <w:r>
+        <w:rPr>
+          <w:rFonts w:ascii="Times New Roman" w:hAnsi="Times New Roman" w:cs="Times New Roman"/>
+          <w:i/>
+          <w:iCs/>
+          <w:sz w:val="24"/>
+          <w:szCs w:val="24"/>
+          <w:lang w:val="en-US"/>
+        </w:rPr>
+        <w:t>out:hello.exe</w:t>
+      </w:r>
+      <w:proofErr w:type="gramEnd"/>
     </w:p>
     <w:p>
       <w:pPr>
@@ -3694,6 +3780,7 @@
       <w:r>
         <w:rPr>
           <w:rFonts w:ascii="Times New Roman" w:hAnsi="Times New Roman" w:cs="Times New Roman"/>
+          <w:noProof/>
           <w:sz w:val="24"/>
           <w:szCs w:val="24"/>
           <w:lang w:val="en-US"/>
@@ -3747,7 +3834,7 @@
 </file>
 
 <file path=word/numbering.xml><?xml version="1.0" encoding="utf-8"?>
-<w:numbering xmlns:wpc="http://schemas.microsoft.com/office/word/2010/wordprocessingCanvas" xmlns:cx="http://schemas.microsoft.com/office/drawing/2014/chartex" xmlns:cx1="http://schemas.microsoft.com/office/drawing/2015/9/8/chartex" xmlns:cx2="http://schemas.microsoft.com/office/drawing/2015/10/21/chartex" xmlns:cx3="http://schemas.microsoft.com/office/drawing/2016/5/9/chartex" xmlns:cx4="http://schemas.microsoft.com/office/drawing/2016/5/10/chartex" xmlns:cx5="http://schemas.microsoft.com/office/drawing/2016/5/11/chartex" xmlns:cx6="http://schemas.microsoft.com/office/drawing/2016/5/12/chartex" xmlns:cx7="http://schemas.microsoft.com/office/drawing/2016/5/13/chartex" xmlns:cx8="http://schemas.microsoft.com/office/drawing/2016/5/14/chartex" xmlns:mc="http://schemas.openxmlformats.org/markup-compatibility/2006" xmlns:aink="http://schemas.microsoft.com/office/drawing/2016/ink" xmlns:am3d="http://schemas.microsoft.com/office/drawing/2017/model3d" xmlns:o="urn:schemas-microsoft-com:office:office" xmlns:r="http://schemas.openxmlformats.org/officeDocument/2006/relationships" xmlns:m="http://schemas.openxmlformats.org/officeDocument/2006/math" xmlns:v="urn:schemas-microsoft-com:vml" xmlns:wp14="http://schemas.microsoft.com/office/word/2010/wordprocessingDrawing" xmlns:wp="http://schemas.openxmlformats.org/drawingml/2006/wordprocessingDrawing" xmlns:w10="urn:schemas-microsoft-com:office:word" xmlns:w="http://schemas.openxmlformats.org/wordprocessingml/2006/main" xmlns:w14="http://schemas.microsoft.com/office/word/2010/wordml" xmlns:w15="http://schemas.microsoft.com/office/word/2012/wordml" xmlns:w16cex="http://schemas.microsoft.com/office/word/2018/wordml/cex" xmlns:w16cid="http://schemas.microsoft.com/office/word/2016/wordml/cid" xmlns:w16="http://schemas.microsoft.com/office/word/2018/wordml" xmlns:w16sdtdh="http://schemas.microsoft.com/office/word/2020/wordml/sdtdatahash" xmlns:w16se="http://schemas.microsoft.com/office/word/2015/wordml/symex" xmlns:wpg="http://schemas.microsoft.com/office/word/2010/wordprocessingGroup" xmlns:wpi="http://schemas.microsoft.com/office/word/2010/wordprocessingInk" xmlns:wne="http://schemas.microsoft.com/office/word/2006/wordml" xmlns:wps="http://schemas.microsoft.com/office/word/2010/wordprocessingShape" mc:Ignorable="w14 w15 w16se w16cid w16 w16cex w16sdtdh wp14">
+<w:numbering xmlns:wpc="http://schemas.microsoft.com/office/word/2010/wordprocessingCanvas" xmlns:cx="http://schemas.microsoft.com/office/drawing/2014/chartex" xmlns:cx1="http://schemas.microsoft.com/office/drawing/2015/9/8/chartex" xmlns:cx2="http://schemas.microsoft.com/office/drawing/2015/10/21/chartex" xmlns:cx3="http://schemas.microsoft.com/office/drawing/2016/5/9/chartex" xmlns:cx4="http://schemas.microsoft.com/office/drawing/2016/5/10/chartex" xmlns:cx5="http://schemas.microsoft.com/office/drawing/2016/5/11/chartex" xmlns:cx6="http://schemas.microsoft.com/office/drawing/2016/5/12/chartex" xmlns:cx7="http://schemas.microsoft.com/office/drawing/2016/5/13/chartex" xmlns:cx8="http://schemas.microsoft.com/office/drawing/2016/5/14/chartex" xmlns:mc="http://schemas.openxmlformats.org/markup-compatibility/2006" xmlns:aink="http://schemas.microsoft.com/office/drawing/2016/ink" xmlns:am3d="http://schemas.microsoft.com/office/drawing/2017/model3d" xmlns:o="urn:schemas-microsoft-com:office:office" xmlns:oel="http://schemas.microsoft.com/office/2019/extlst" xmlns:r="http://schemas.openxmlformats.org/officeDocument/2006/relationships" xmlns:m="http://schemas.openxmlformats.org/officeDocument/2006/math" xmlns:v="urn:schemas-microsoft-com:vml" xmlns:wp14="http://schemas.microsoft.com/office/word/2010/wordprocessingDrawing" xmlns:wp="http://schemas.openxmlformats.org/drawingml/2006/wordprocessingDrawing" xmlns:w10="urn:schemas-microsoft-com:office:word" xmlns:w="http://schemas.openxmlformats.org/wordprocessingml/2006/main" xmlns:w14="http://schemas.microsoft.com/office/word/2010/wordml" xmlns:w15="http://schemas.microsoft.com/office/word/2012/wordml" xmlns:w16cex="http://schemas.microsoft.com/office/word/2018/wordml/cex" xmlns:w16cid="http://schemas.microsoft.com/office/word/2016/wordml/cid" xmlns:w16="http://schemas.microsoft.com/office/word/2018/wordml" xmlns:w16du="http://schemas.microsoft.com/office/word/2023/wordml/word16du" xmlns:w16sdtdh="http://schemas.microsoft.com/office/word/2020/wordml/sdtdatahash" xmlns:w16sdtfl="http://schemas.microsoft.com/office/word/2024/wordml/sdtformatlock" xmlns:w16se="http://schemas.microsoft.com/office/word/2015/wordml/symex" xmlns:wpg="http://schemas.microsoft.com/office/word/2010/wordprocessingGroup" xmlns:wpi="http://schemas.microsoft.com/office/word/2010/wordprocessingInk" xmlns:wne="http://schemas.microsoft.com/office/word/2006/wordml" xmlns:wps="http://schemas.microsoft.com/office/word/2010/wordprocessingShape" mc:Ignorable="w14 w15 w16se w16cid w16 w16cex w16sdtdh w16sdtfl w16du wp14">
   <w:abstractNum w:abstractNumId="0" w15:restartNumberingAfterBreak="0">
     <w:nsid w:val="06D36AD9"/>
     <w:multiLevelType w:val="hybridMultilevel"/>
@@ -4217,26 +4304,26 @@
       </w:rPr>
     </w:lvl>
   </w:abstractNum>
-  <w:num w:numId="1">
+  <w:num w:numId="1" w16cid:durableId="1624534694">
     <w:abstractNumId w:val="0"/>
   </w:num>
-  <w:num w:numId="2">
+  <w:num w:numId="2" w16cid:durableId="519899290">
     <w:abstractNumId w:val="3"/>
   </w:num>
-  <w:num w:numId="3">
+  <w:num w:numId="3" w16cid:durableId="1550415084">
     <w:abstractNumId w:val="4"/>
   </w:num>
-  <w:num w:numId="4">
+  <w:num w:numId="4" w16cid:durableId="2087068522">
     <w:abstractNumId w:val="2"/>
   </w:num>
-  <w:num w:numId="5">
+  <w:num w:numId="5" w16cid:durableId="828519354">
     <w:abstractNumId w:val="1"/>
   </w:num>
 </w:numbering>
 </file>
 
 <file path=word/styles.xml><?xml version="1.0" encoding="utf-8"?>
-<w:styles xmlns:mc="http://schemas.openxmlformats.org/markup-compatibility/2006" xmlns:r="http://schemas.openxmlformats.org/officeDocument/2006/relationships" xmlns:w="http://schemas.openxmlformats.org/wordprocessingml/2006/main" xmlns:w14="http://schemas.microsoft.com/office/word/2010/wordml" xmlns:w15="http://schemas.microsoft.com/office/word/2012/wordml" xmlns:w16cex="http://schemas.microsoft.com/office/word/2018/wordml/cex" xmlns:w16cid="http://schemas.microsoft.com/office/word/2016/wordml/cid" xmlns:w16="http://schemas.microsoft.com/office/word/2018/wordml" xmlns:w16sdtdh="http://schemas.microsoft.com/office/word/2020/wordml/sdtdatahash" xmlns:w16se="http://schemas.microsoft.com/office/word/2015/wordml/symex" mc:Ignorable="w14 w15 w16se w16cid w16 w16cex w16sdtdh">
+<w:styles xmlns:mc="http://schemas.openxmlformats.org/markup-compatibility/2006" xmlns:r="http://schemas.openxmlformats.org/officeDocument/2006/relationships" xmlns:w="http://schemas.openxmlformats.org/wordprocessingml/2006/main" xmlns:w14="http://schemas.microsoft.com/office/word/2010/wordml" xmlns:w15="http://schemas.microsoft.com/office/word/2012/wordml" xmlns:w16cex="http://schemas.microsoft.com/office/word/2018/wordml/cex" xmlns:w16cid="http://schemas.microsoft.com/office/word/2016/wordml/cid" xmlns:w16="http://schemas.microsoft.com/office/word/2018/wordml" xmlns:w16du="http://schemas.microsoft.com/office/word/2023/wordml/word16du" xmlns:w16sdtdh="http://schemas.microsoft.com/office/word/2020/wordml/sdtdatahash" xmlns:w16sdtfl="http://schemas.microsoft.com/office/word/2024/wordml/sdtformatlock" xmlns:w16se="http://schemas.microsoft.com/office/word/2015/wordml/symex" mc:Ignorable="w14 w15 w16se w16cid w16 w16cex w16sdtdh w16sdtfl w16du">
   <w:docDefaults>
     <w:rPrDefault>
       <w:rPr>

</xml_diff>